<commit_message>
feat(CR-040): username theo ten that, auto-suggest + doi ten tai khoan demo
- src/lib/username.ts: usernameBase (bo dau, ten + viet tat ho dem) +
  suggestUsername (hau to so khi trung) + unit tests
- /school/users: go ho ten -> tu de xuat email @<domain truong>, sua tay duoc
- bootstrap-school.mjs: can_bo.email trong -> tu sinh + dedupe, them --domain
- rename-demo-accounts.mjs: doi 88 tai khoan demo prod sang quy uoc moi
  (gvcn@demo.scn -> anhptl@nd.scn...), admin giu nguyen
- email.ts + cron parent-digest: block moi *.scn (parent contacts la @mail.scn,
  block @demo.scn cu khong con cover)
- template xlsx + seed + 20 file docs/QA cap nhat email moi; regen pptx/docx

Generated with [Devin](https://devin.ai)

Co-Authored-By: Devin <158243242+devin-ai-integration[bot]@users.noreply.github.com>
</commit_message>
<xml_diff>
--- a/docs/handover/SO-CHU-NHIEM-SO-TAI-LIEU.docx
+++ b/docs/handover/SO-CHU-NHIEM-SO-TAI-LIEU.docx
@@ -339,7 +339,7 @@
               <w:rPr>
                 <w:sz w:val="18"/>
               </w:rPr>
-              <w:t>gvcn@demo.scn</w:t>
+              <w:t>anhptl@nd.scn</w:t>
             </w:r>
           </w:p>
         </w:tc>
@@ -426,7 +426,7 @@
               <w:rPr>
                 <w:sz w:val="18"/>
               </w:rPr>
-              <w:t>gvbm@demo.scn</w:t>
+              <w:t>minhtv@nd.scn</w:t>
             </w:r>
           </w:p>
         </w:tc>
@@ -480,7 +480,7 @@
               <w:rPr>
                 <w:sz w:val="18"/>
               </w:rPr>
-              <w:t>totruong@demo.scn</w:t>
+              <w:t>hanhlth@nd.scn</w:t>
             </w:r>
           </w:p>
         </w:tc>
@@ -554,7 +554,7 @@
               <w:rPr>
                 <w:sz w:val="18"/>
               </w:rPr>
-              <w:t>bgh@demo.scn</w:t>
+              <w:t>hainv@nd.scn</w:t>
             </w:r>
           </w:p>
         </w:tc>
@@ -628,7 +628,7 @@
               <w:rPr>
                 <w:sz w:val="18"/>
               </w:rPr>
-              <w:t>pht@demo.scn</w:t>
+              <w:t>duclm@nd.scn</w:t>
             </w:r>
           </w:p>
         </w:tc>
@@ -702,7 +702,7 @@
               <w:rPr>
                 <w:sz w:val="18"/>
               </w:rPr>
-              <w:t>ketoan@demo.scn</w:t>
+              <w:t>trangpt@nd.scn</w:t>
             </w:r>
           </w:p>
         </w:tc>
@@ -756,7 +756,7 @@
               <w:rPr>
                 <w:sz w:val="18"/>
               </w:rPr>
-              <w:t>sogd@demo.scn</w:t>
+              <w:t>sovqt@demo.scn</w:t>
             </w:r>
           </w:p>
         </w:tc>
@@ -810,7 +810,7 @@
               <w:rPr>
                 <w:sz w:val="18"/>
               </w:rPr>
-              <w:t>ubnd@demo.scn</w:t>
+              <w:t>daonvl@demo.scn</w:t>
             </w:r>
           </w:p>
         </w:tc>
@@ -864,7 +864,7 @@
               <w:rPr>
                 <w:sz w:val="18"/>
               </w:rPr>
-              <w:t>phuhuynh@demo.scn</w:t>
+              <w:t>annv@nd.scn</w:t>
             </w:r>
           </w:p>
         </w:tc>
@@ -918,7 +918,7 @@
               <w:rPr>
                 <w:sz w:val="18"/>
               </w:rPr>
-              <w:t>hocsinh@demo.scn</w:t>
+              <w:t>baong@nd.scn</w:t>
             </w:r>
           </w:p>
         </w:tc>
@@ -1018,7 +1018,7 @@
               <w:rPr>
                 <w:sz w:val="18"/>
               </w:rPr>
-              <w:t>bgh.cva@demo.scn (HT Trần Thị Mai Phương), gvcn.cva@demo.scn (GVCN Đỗ Thị Kim Oanh), totruong.cva@demo.scn (TT Trương Thị Bích Liên), ketoan.cva@demo.scn</w:t>
+              <w:t>phuongttm@cva.scn (HT Trần Thị Mai Phương), oanhdtk@cva.scn (GVCN Đỗ Thị Kim Oanh), lienttb@cva.scn (TT Trương Thị Bích Liên), havt@cva.scn</w:t>
             </w:r>
           </w:p>
         </w:tc>
@@ -1046,7 +1046,7 @@
               <w:rPr>
                 <w:sz w:val="18"/>
               </w:rPr>
-              <w:t>bgh.kd@demo.scn (HT Hoàng Đức Long), gvcn.kd@demo.scn (GVCN Lý Thị Thanh Nga), ketoan.kd@demo.scn</w:t>
+              <w:t>longhd@kd.scn (HT Hoàng Đức Long), ngaltt@kd.scn (GVCN Lý Thị Thanh Nga), anhdn@kd.scn</w:t>
             </w:r>
           </w:p>
         </w:tc>
@@ -5594,7 +5594,27 @@
     </w:p>
     <w:p>
       <w:r>
-        <w:t xml:space="preserve">Môi trường demo có sẵn danh sách vai trò trong ô "Đăng nhập với vai trò (demo)" - chọn vai trò để hệ thống tự điền tài khoản. Mật khẩu demo chung: </w:t>
+        <w:t xml:space="preserve">Môi trường demo: tài khoản theo quy ước tên thật </w:t>
+      </w:r>
+      <w:r>
+        <w:rPr>
+          <w:rFonts w:ascii="Consolas" w:hAnsi="Consolas"/>
+          <w:sz w:val="18"/>
+        </w:rPr>
+        <w:t>&lt;tên&gt;&lt;viết tắt họ đệm&gt;@&lt;domain trường&gt;</w:t>
+      </w:r>
+      <w:r>
+        <w:t xml:space="preserve"> (vd </w:t>
+      </w:r>
+      <w:r>
+        <w:rPr>
+          <w:rFonts w:ascii="Consolas" w:hAnsi="Consolas"/>
+          <w:sz w:val="18"/>
+        </w:rPr>
+        <w:t>anhptl@nd.scn</w:t>
+      </w:r>
+      <w:r>
+        <w:t xml:space="preserve"> = cô Phạm Thị Lan Anh), mật khẩu chung </w:t>
       </w:r>
       <w:r>
         <w:rPr>
@@ -5602,6 +5622,16 @@
           <w:sz w:val="18"/>
         </w:rPr>
         <w:t>demo1234</w:t>
+      </w:r>
+      <w:r>
+        <w:t xml:space="preserve"> - danh sách đầy đủ trong </w:t>
+      </w:r>
+      <w:r>
+        <w:rPr>
+          <w:rFonts w:ascii="Consolas" w:hAnsi="Consolas"/>
+          <w:sz w:val="18"/>
+        </w:rPr>
+        <w:t>KICH-BAN-DEMO.md</w:t>
       </w:r>
       <w:r>
         <w:t>.</w:t>

</xml_diff>